<commit_message>
update Document folder - add new files + rename + delete old files
</commit_message>
<xml_diff>
--- a/Document/Bia trong và bia ngoai _BaocaoTomtat.docx
+++ b/Document/Bia trong và bia ngoai _BaocaoTomtat.docx
@@ -626,17 +626,40 @@
           <w:sz w:val="28"/>
           <w:szCs w:val="28"/>
         </w:rPr>
-        <w:t xml:space="preserve"> M</w:t>
-      </w:r>
-      <w:r>
-        <w:rPr>
-          <w:b/>
-          <w:i/>
-          <w:color w:val="0000CC"/>
-          <w:sz w:val="28"/>
-          <w:szCs w:val="28"/>
-        </w:rPr>
-        <w:t xml:space="preserve">.S. </w:t>
+        <w:t xml:space="preserve"> </w:t>
+      </w:r>
+      <w:proofErr w:type="spellStart"/>
+      <w:r>
+        <w:rPr>
+          <w:b/>
+          <w:i/>
+          <w:color w:val="0000CC"/>
+          <w:spacing w:val="-1"/>
+          <w:sz w:val="28"/>
+          <w:szCs w:val="28"/>
+        </w:rPr>
+        <w:t>Th</w:t>
+      </w:r>
+      <w:r>
+        <w:rPr>
+          <w:b/>
+          <w:i/>
+          <w:color w:val="0000CC"/>
+          <w:sz w:val="28"/>
+          <w:szCs w:val="28"/>
+        </w:rPr>
+        <w:t>S</w:t>
+      </w:r>
+      <w:proofErr w:type="spellEnd"/>
+      <w:r>
+        <w:rPr>
+          <w:b/>
+          <w:i/>
+          <w:color w:val="0000CC"/>
+          <w:sz w:val="28"/>
+          <w:szCs w:val="28"/>
+        </w:rPr>
+        <w:t xml:space="preserve">. </w:t>
       </w:r>
       <w:r>
         <w:rPr>
@@ -1491,7 +1514,18 @@
           <w:sz w:val="28"/>
           <w:szCs w:val="28"/>
         </w:rPr>
-        <w:t xml:space="preserve"> M</w:t>
+        <w:t xml:space="preserve"> </w:t>
+      </w:r>
+      <w:r>
+        <w:rPr>
+          <w:b/>
+          <w:i/>
+          <w:color w:val="0000CC"/>
+          <w:spacing w:val="-1"/>
+          <w:sz w:val="28"/>
+          <w:szCs w:val="28"/>
+        </w:rPr>
+        <w:t>Th</w:t>
       </w:r>
       <w:r>
         <w:rPr>
@@ -2122,6 +2156,7 @@
     <w:lsdException w:name="HTML Sample" w:semiHidden="1" w:unhideWhenUsed="1"/>
     <w:lsdException w:name="HTML Typewriter" w:semiHidden="1" w:unhideWhenUsed="1"/>
     <w:lsdException w:name="HTML Variable" w:semiHidden="1" w:unhideWhenUsed="1"/>
+    <w:lsdException w:name="Normal Table" w:semiHidden="1" w:unhideWhenUsed="1"/>
     <w:lsdException w:name="annotation subject" w:semiHidden="1" w:unhideWhenUsed="1"/>
     <w:lsdException w:name="No List" w:semiHidden="1" w:unhideWhenUsed="1"/>
     <w:lsdException w:name="Outline List 1" w:semiHidden="1" w:unhideWhenUsed="1"/>
@@ -2164,8 +2199,11 @@
     <w:lsdException w:name="Table Contemporary" w:semiHidden="1" w:unhideWhenUsed="1"/>
     <w:lsdException w:name="Table Elegant" w:semiHidden="1" w:unhideWhenUsed="1"/>
     <w:lsdException w:name="Table Professional" w:semiHidden="1" w:unhideWhenUsed="1"/>
+    <w:lsdException w:name="Table Subtle 1" w:semiHidden="1" w:unhideWhenUsed="1"/>
     <w:lsdException w:name="Table Subtle 2" w:semiHidden="1" w:unhideWhenUsed="1"/>
     <w:lsdException w:name="Table Web 1" w:semiHidden="1" w:unhideWhenUsed="1"/>
+    <w:lsdException w:name="Table Web 2" w:semiHidden="1" w:unhideWhenUsed="1"/>
+    <w:lsdException w:name="Table Web 3" w:semiHidden="1" w:unhideWhenUsed="1"/>
     <w:lsdException w:name="Balloon Text" w:semiHidden="1" w:unhideWhenUsed="1"/>
     <w:lsdException w:name="Table Grid" w:uiPriority="39"/>
     <w:lsdException w:name="Table Theme" w:semiHidden="1" w:unhideWhenUsed="1"/>

</xml_diff>